<commit_message>
feat: CI frontend, jeton JWT dans Swagger UI et mise à jour de la documentation
- Workflow GitHub Actions ci-frontend.yml (Node 22, npm ci, tests Vitest, build Angular)
- OpenApiConfig : schéma bearerAuth appliqué à l'API, /auth/login exempté ; test associé
- Documentation §7.10 : nouvelle capture de l'email d'alerte (rupture imminente / stock bas),
  mention du classement en spam ; exports .docx / .pdf régénérés
- README : section « Outils et assistance »

Co-Authored-By: Claude Opus 5.5 <noreply@anthropic.com>
</commit_message>
<xml_diff>
--- a/docs/documentation-technique.docx
+++ b/docs/documentation-technique.docx
@@ -834,6 +834,7 @@
       </w:pPr>
       <w:bookmarkStart w:id="6" w:name="_4de304b59de260d5f1942475db1f3109e72398e"/>
       <w:r>
+        <w:lastRenderedPageBreak/>
         <w:t>2. Architecture générale</w:t>
       </w:r>
       <w:bookmarkEnd w:id="6"/>
@@ -3923,6 +3924,7 @@
           <w:b/>
           <w:bCs/>
         </w:rPr>
+        <w:lastRenderedPageBreak/>
         <w:t>Illustration — tentative d'accès à une route non autorisée</w:t>
       </w:r>
     </w:p>
@@ -3934,7 +3936,6 @@
         <w:rPr>
           <w:noProof/>
         </w:rPr>
-        <w:lastRenderedPageBreak/>
         <w:drawing>
           <wp:inline distT="0" distB="0" distL="0" distR="0" wp14:anchorId="643C381E" wp14:editId="7541D2D4">
             <wp:extent cx="5334000" cy="6445933"/>
@@ -5082,6 +5083,7 @@
       </w:pPr>
       <w:bookmarkStart w:id="25" w:name="_8cbfeb4aa7e7af72c267e6dd30769a2b4f6f837"/>
       <w:r>
+        <w:lastRenderedPageBreak/>
         <w:t>5.7 Alerte de stock quotidienne par email</w:t>
       </w:r>
       <w:bookmarkEnd w:id="25"/>
@@ -5177,6 +5179,7 @@
       </w:pPr>
       <w:bookmarkStart w:id="26" w:name="_c0f8e6fc4d7595d8662b4f5ab528e54aa3351f1"/>
       <w:r>
+        <w:lastRenderedPageBreak/>
         <w:t>5.8 Archivage de la facture PDF côté serveur</w:t>
       </w:r>
       <w:bookmarkEnd w:id="26"/>
@@ -5261,6 +5264,7 @@
       </w:pPr>
       <w:bookmarkStart w:id="27" w:name="_7e541b32afb701afd497b315b2a20f19aa41fab"/>
       <w:r>
+        <w:lastRenderedPageBreak/>
         <w:t>6. Diagramme d'activité — cycle de vente et de réapprovisionnement</w:t>
       </w:r>
       <w:bookmarkEnd w:id="27"/>
@@ -5282,6 +5286,7 @@
         <w:rPr>
           <w:noProof/>
         </w:rPr>
+        <w:lastRenderedPageBreak/>
         <w:drawing>
           <wp:inline distT="0" distB="0" distL="0" distR="0" wp14:anchorId="3569FA61" wp14:editId="3DB71E00">
             <wp:extent cx="5334000" cy="28478275"/>
@@ -5330,6 +5335,7 @@
         <w:pStyle w:val="ImageCaption"/>
       </w:pPr>
       <w:r>
+        <w:lastRenderedPageBreak/>
         <w:t>Diagramme</w:t>
       </w:r>
     </w:p>
@@ -5483,6 +5489,7 @@
       </w:pPr>
       <w:bookmarkStart w:id="30" w:name="_0d76cf150681b2e6363b542f9250c6f2232e357"/>
       <w:r>
+        <w:lastRenderedPageBreak/>
         <w:t>7.2 Tableau de bord</w:t>
       </w:r>
       <w:bookmarkEnd w:id="30"/>
@@ -5684,6 +5691,7 @@
           <w:b/>
           <w:bCs/>
         </w:rPr>
+        <w:lastRenderedPageBreak/>
         <w:t>Graphiques et alertes de stock</w:t>
       </w:r>
     </w:p>
@@ -5798,6 +5806,7 @@
       </w:pPr>
       <w:bookmarkStart w:id="31" w:name="_0b79b4f2367e57366f82d1112de638b05abdc46"/>
       <w:r>
+        <w:lastRenderedPageBreak/>
         <w:t>7.3 Gestion des clients</w:t>
       </w:r>
       <w:bookmarkEnd w:id="31"/>
@@ -5959,7 +5968,11 @@
         <w:pStyle w:val="FirstParagraph"/>
       </w:pPr>
       <w:r>
-        <w:t xml:space="preserve">Formulaire client réutilisé à l'identique pour la création et la modification, avec validations en temps réel (nom et prénom obligatoires, format d'email, téléphone à exactement 10 chiffres). Le message de succès en tête de page (« Client mis à jour avec succès ! ») confirme l'action ; les messages d'erreur sous chaque champ apparaissent uniquement si la validation échoue. Les mêmes règles sont appliquées côté serveur (voir §4.4). Le formulaire n'est affiché qu'aux rôles </w:t>
+        <w:t xml:space="preserve">Formulaire client réutilisé à l'identique pour la création et la modification, avec validations en temps réel (nom et prénom obligatoires, format d'email, téléphone à exactement 10 chiffres). Le message de succès en tête de page (« Client mis à jour avec succès ! ») confirme l'action ; les messages d'erreur sous chaque champ apparaissent uniquement si la validation échoue. Les mêmes règles sont appliquées côté serveur (voir §4.4). Le formulaire </w:t>
+      </w:r>
+      <w:r>
+        <w:lastRenderedPageBreak/>
+        <w:t xml:space="preserve">n'est affiché qu'aux rôles </w:t>
       </w:r>
       <w:r>
         <w:rPr>
@@ -6191,7 +6204,11 @@
         <w:t>caissier</w:t>
       </w:r>
       <w:r>
-        <w:t>. La barre de navigation ne propose que les onglets Clients, Produits et Commandes (pas de tableau de bord, de fournisseurs, d'achats ni de journal d'audit). Le formulaire « Nouveau client » et la colonne Action sont absents : le caissier recherche, consulte et exporte la liste, mais ne peut ni créer, ni modifier, ni supprimer un client, conformément aux règles du serveur (§4.2).</w:t>
+        <w:t xml:space="preserve">. La barre de navigation ne propose que les onglets Clients, Produits et Commandes (pas de tableau de bord, de fournisseurs, d'achats ni de journal d'audit). Le formulaire « Nouveau client » et la colonne Action sont </w:t>
+      </w:r>
+      <w:r>
+        <w:lastRenderedPageBreak/>
+        <w:t>absents : le caissier recherche, consulte et exporte la liste, mais ne peut ni créer, ni modifier, ni supprimer un client, conformément aux règles du serveur (§4.2).</w:t>
       </w:r>
     </w:p>
     <w:p>
@@ -6392,6 +6409,7 @@
           <w:b/>
           <w:bCs/>
         </w:rPr>
+        <w:lastRenderedPageBreak/>
         <w:t>Formulaire — modification</w:t>
       </w:r>
     </w:p>
@@ -6561,6 +6579,7 @@
           <w:b/>
           <w:bCs/>
         </w:rPr>
+        <w:lastRenderedPageBreak/>
         <w:t>Liste des produits</w:t>
       </w:r>
     </w:p>
@@ -6851,6 +6870,7 @@
           <w:b/>
           <w:bCs/>
         </w:rPr>
+        <w:lastRenderedPageBreak/>
         <w:t>Liste des produits — vue caissier</w:t>
       </w:r>
     </w:p>
@@ -6863,7 +6883,7 @@
           <w:noProof/>
         </w:rPr>
         <w:drawing>
-          <wp:inline distT="0" distB="0" distL="0" distR="0" wp14:anchorId="7A8D62EF" wp14:editId="0E2FD8D5">
+          <wp:inline distT="0" distB="0" distL="0" distR="0" wp14:anchorId="7A8D62EF" wp14:editId="0A365C71">
             <wp:extent cx="5334000" cy="2268906"/>
             <wp:effectExtent l="0" t="0" r="0" b="0"/>
             <wp:docPr id="1108472297" name="Image 1" descr="Liste des produits vue caissier"/>
@@ -7029,6 +7049,7 @@
           <w:b/>
           <w:bCs/>
         </w:rPr>
+        <w:lastRenderedPageBreak/>
         <w:t>Liste des commandes et facturation</w:t>
       </w:r>
     </w:p>
@@ -7249,6 +7270,7 @@
       </w:pPr>
       <w:bookmarkStart w:id="35" w:name="_5975cb26d92caeb229313bc7acd26b08588ea94"/>
       <w:r>
+        <w:lastRenderedPageBreak/>
         <w:t>7.7 Fournisseurs</w:t>
       </w:r>
       <w:bookmarkEnd w:id="35"/>
@@ -7523,6 +7545,7 @@
           <w:b/>
           <w:bCs/>
         </w:rPr>
+        <w:lastRenderedPageBreak/>
         <w:t>Liste des fournisseurs — vue gestionnaire</w:t>
       </w:r>
     </w:p>
@@ -7535,7 +7558,7 @@
           <w:noProof/>
         </w:rPr>
         <w:drawing>
-          <wp:inline distT="0" distB="0" distL="0" distR="0" wp14:anchorId="3BE33F28" wp14:editId="32D771A7">
+          <wp:inline distT="0" distB="0" distL="0" distR="0" wp14:anchorId="3BE33F28" wp14:editId="32448886">
             <wp:extent cx="5334000" cy="1684242"/>
             <wp:effectExtent l="0" t="0" r="0" b="0"/>
             <wp:docPr id="783165910" name="Image 1" descr="Liste des fournisseurs vue gestionnaire"/>
@@ -7761,6 +7784,7 @@
         <w:pStyle w:val="FirstParagraph"/>
       </w:pPr>
       <w:r>
+        <w:lastRenderedPageBreak/>
         <w:t xml:space="preserve">Sélection du fournisseur, ajout de produits avec quantité et </w:t>
       </w:r>
       <w:r>
@@ -7931,6 +7955,7 @@
       </w:pPr>
       <w:bookmarkStart w:id="37" w:name="_5e87025747a18e261c6abce4835a7065e163500"/>
       <w:r>
+        <w:lastRenderedPageBreak/>
         <w:t>7.9 Journal d'audit</w:t>
       </w:r>
       <w:bookmarkEnd w:id="37"/>
@@ -8119,6 +8144,7 @@
         <w:pStyle w:val="FirstParagraph"/>
       </w:pPr>
       <w:r>
+        <w:lastRenderedPageBreak/>
         <w:t xml:space="preserve">Onglet Réseau des outils de développement du navigateur, montrant l'en-tête </w:t>
       </w:r>
       <w:r>
@@ -8316,6 +8342,7 @@
           <w:b/>
           <w:bCs/>
         </w:rPr>
+        <w:lastRenderedPageBreak/>
         <w:t>Alerte de stock reçue par email</w:t>
       </w:r>
     </w:p>
@@ -8328,40 +8355,40 @@
           <w:noProof/>
         </w:rPr>
         <w:drawing>
-          <wp:inline distT="0" distB="0" distL="0" distR="0" wp14:anchorId="68159E95" wp14:editId="20719AF0">
-            <wp:extent cx="5334000" cy="2358070"/>
+          <wp:inline distT="0" distB="0" distL="0" distR="0" wp14:anchorId="527A1FCE" wp14:editId="631C7872">
+            <wp:extent cx="5334000" cy="1935461"/>
             <wp:effectExtent l="0" t="0" r="0" b="0"/>
-            <wp:docPr id="165" name="Picture" descr="Email d'alerte stock reçu"/>
-            <wp:cNvGraphicFramePr/>
+            <wp:docPr id="772373164" name="Image 1" descr="Email d'alerte stock reçu"/>
+            <wp:cNvGraphicFramePr>
+              <a:graphicFrameLocks xmlns:a="http://schemas.openxmlformats.org/drawingml/2006/main" noChangeAspect="1"/>
+            </wp:cNvGraphicFramePr>
             <a:graphic xmlns:a="http://schemas.openxmlformats.org/drawingml/2006/main">
               <a:graphicData uri="http://schemas.openxmlformats.org/drawingml/2006/picture">
                 <pic:pic xmlns:pic="http://schemas.openxmlformats.org/drawingml/2006/picture">
                   <pic:nvPicPr>
-                    <pic:cNvPr id="166" name="Picture" descr="../screenshots/Capture%20d'%C3%A9cran%202026-08-11%20204155.png"/>
-                    <pic:cNvPicPr>
-                      <a:picLocks noChangeAspect="1" noChangeArrowheads="1"/>
-                    </pic:cNvPicPr>
+                    <pic:cNvPr id="772373164" name="Image 1" descr="Email d'alerte stock reçu"/>
+                    <pic:cNvPicPr/>
                   </pic:nvPicPr>
                   <pic:blipFill>
-                    <a:blip r:embed="rId48"/>
+                    <a:blip r:embed="rId48">
+                      <a:extLst>
+                        <a:ext uri="{28A0092B-C50C-407E-A947-70E740481C1C}">
+                          <a14:useLocalDpi xmlns:a14="http://schemas.microsoft.com/office/drawing/2010/main" val="0"/>
+                        </a:ext>
+                      </a:extLst>
+                    </a:blip>
                     <a:stretch>
                       <a:fillRect/>
                     </a:stretch>
                   </pic:blipFill>
-                  <pic:spPr bwMode="auto">
+                  <pic:spPr>
                     <a:xfrm>
                       <a:off x="0" y="0"/>
-                      <a:ext cx="5334000" cy="2358070"/>
+                      <a:ext cx="5334000" cy="1935461"/>
                     </a:xfrm>
                     <a:prstGeom prst="rect">
                       <a:avLst/>
                     </a:prstGeom>
-                    <a:noFill/>
-                    <a:ln w="9525">
-                      <a:noFill/>
-                      <a:headEnd/>
-                      <a:tailEnd/>
-                    </a:ln>
                   </pic:spPr>
                 </pic:pic>
               </a:graphicData>
@@ -8383,7 +8410,7 @@
         <w:pStyle w:val="FirstParagraph"/>
       </w:pPr>
       <w:r>
-        <w:t xml:space="preserve">Email réellement reçu, déclenché par le job planifié quotidien (voir §5.7), listant les produits en rupture (« Telephone iphone 14 Pro », stock à 0) et en stock bas (« Chargeur Dell », quantité restante : 8). Cette capture montre l'ancien format du message, qui séparait les produits à 0 de tous les autres. Depuis, l'email applique les seuils partagés </w:t>
+        <w:t xml:space="preserve">Email réellement reçu, déclenché par le job planifié quotidien (voir §5.7). Il applique les seuils partagés </w:t>
       </w:r>
       <w:r>
         <w:rPr>
@@ -8392,7 +8419,7 @@
         <w:t>StockSeuils</w:t>
       </w:r>
       <w:r>
-        <w:t xml:space="preserve"> : une section « rupture imminente (moins de 5 unités) » et une section « stock bas (de 5 à 9 unités) », avec la quantité restante dans les deux (voir §5.7). À noter : lors de ce test, le message a été classé par le fournisseur de messagerie dans le dossier spam — un comportement attendu pour une adresse d'expédition sans historique d'envoi (voir §8.2 pour les pistes d'amélioration de la délivrabilité).</w:t>
+        <w:t xml:space="preserve"> et contient deux listes : « Produits en rupture imminente (moins de 5 unités) », avec « Telephone iphone 14 Pro (quantité restante : 3) », et « Produits en stock bas (de 5 à 9 unités) », avec « Chargeur Dell (quantité restante : 8) ». Lors du test, l'email est arrivé dans le dossier spam du destinataire : c'est une limite connue de l'envoi SMTP simple, sans authentification du domaine expéditeur (voir §9 pour les pistes d'amélioration de la délivrabilité). Il a été signalé comme « non spam » avant la capture, ce qui explique qu'il apparaisse ici dans la boîte de réception.</w:t>
       </w:r>
     </w:p>
     <w:p>
@@ -8662,7 +8689,11 @@
               <w:t>home.spec.ts</w:t>
             </w:r>
             <w:r>
-              <w:t>), couleur du badge de stock selon les seuils (</w:t>
+              <w:t xml:space="preserve">), </w:t>
+            </w:r>
+            <w:r>
+              <w:lastRenderedPageBreak/>
+              <w:t>couleur du badge de stock selon les seuils (</w:t>
             </w:r>
             <w:r>
               <w:rPr>
@@ -8695,6 +8726,7 @@
           <w:b/>
           <w:bCs/>
         </w:rPr>
+        <w:lastRenderedPageBreak/>
         <w:t>Classes de tests backend :</w:t>
       </w:r>
     </w:p>
@@ -9101,7 +9133,11 @@
         <w:t>Double génération de la facture PDF</w:t>
       </w:r>
       <w:r>
-        <w:t xml:space="preserve"> : une génération côté client (jsPDF), pour un téléchargement immédiat sans aller-retour serveur au moment de la vente, et une génération côté serveur (OpenPDF), déclenchée automatiquement et archivée sur le disque, pour garantir qu'un document existe et reste consultable même si la facture n'a jamais été téléchargée. Les deux répondent à des besoins différents plutôt que de faire doublon : l'une est un confort d'usage, l'autre une garantie d'archivage.</w:t>
+        <w:t xml:space="preserve"> : une génération côté client (jsPDF), pour un téléchargement immédiat sans aller-retour serveur au moment de la vente, et une </w:t>
+      </w:r>
+      <w:r>
+        <w:lastRenderedPageBreak/>
+        <w:t>génération côté serveur (OpenPDF), déclenchée automatiquement et archivée sur le disque, pour garantir qu'un document existe et reste consultable même si la facture n'a jamais été téléchargée. Les deux répondent à des besoins différents plutôt que de faire doublon : l'une est un confort d'usage, l'autre une garantie d'archivage.</w:t>
       </w:r>
     </w:p>
     <w:p>
@@ -10886,7 +10922,6 @@
   <w:style w:type="character" w:default="1" w:styleId="Policepardfaut">
     <w:name w:val="Default Paragraph Font"/>
     <w:uiPriority w:val="1"/>
-    <w:semiHidden/>
     <w:unhideWhenUsed/>
   </w:style>
   <w:style w:type="table" w:default="1" w:styleId="TableauNormal">

</xml_diff>